<commit_message>
Generator basic-service reminders; fix Netgear/EdgeSwitch addport direction
</commit_message>
<xml_diff>
--- a/docs/switch-config-generator-guide.docx
+++ b/docs/switch-config-generator-guide.docx
@@ -1740,6 +1740,22 @@
     </w:p>
     <w:p>
       <w:pPr>
+        <w:pStyle w:val="ListBullet"/>
+      </w:pPr>
+      <w:r>
+        <w:t>2026-10-07 產生前安全稽核新增「基礎服務提醒」（不計分）：未填 Syslog 伺服器、或所選廠牌的產生結果不含 Syslog 設定時提醒；產生結果不含 NTP 校時與 TACACS+／RADIUS 遠端認證，一律提醒產生後自行補上。Cisco 與 Comware 會附上範例指令（角括號內換成實際值）。</w:t>
+      </w:r>
+    </w:p>
+    <w:p>
+      <w:pPr>
+        <w:pStyle w:val="ListBullet"/>
+      </w:pPr>
+      <w:r>
+        <w:t>2026-10-07 修正 Netgear M4300 與 Ubiquiti EdgeSwitch 的聚合埠語法：addport 改為寫在成員埠自己的介面區塊內（Netgear 為 addport lag N，EdgeSwitch 依官方範例為 addport 3/N），LAG 區塊只放 VLAN 與 port-channel static。先前版本把 addport 寫在 LAG 區塊內，方向相反。</w:t>
+      </w:r>
+    </w:p>
+    <w:p>
+      <w:pPr>
         <w:pStyle w:val="Heading1"/>
       </w:pPr>
       <w:r>

</xml_diff>